<commit_message>
Đào Văn Khiêm: Cập nhật báo cáo - fix fone chữ, căn chỉnh lại định dạng
</commit_message>
<xml_diff>
--- a/docs/baocao.docx
+++ b/docs/baocao.docx
@@ -120,7 +120,7 @@
               </wp:anchor>
             </w:drawing>
           </mc:Choice>
-          <mc:Fallback xmlns:w16sdtfl="http://schemas.microsoft.com/office/word/2024/wordml/sdtformatlock" xmlns:w16du="http://schemas.microsoft.com/office/word/2023/wordml/word16du" xmlns:oel="http://schemas.microsoft.com/office/2019/extlst">
+          <mc:Fallback xmlns:oel="http://schemas.microsoft.com/office/2019/extlst" xmlns:w16du="http://schemas.microsoft.com/office/word/2023/wordml/word16du" xmlns:w16sdtfl="http://schemas.microsoft.com/office/word/2024/wordml/sdtformatlock">
             <w:pict>
               <v:shapetype w14:anchorId="6780BD3A" id="_x0000_t32" coordsize="21600,21600" o:spt="32" o:oned="t" path="m,l21600,21600e" filled="f">
                 <v:path arrowok="t" fillok="f" o:connecttype="none"/>
@@ -679,29 +679,14 @@
         </w:rPr>
         <w:t>ĐÀO VĂN KHIÊM</w:t>
       </w:r>
-    </w:p>
-    <w:p>
-      <w:pPr>
-        <w:pStyle w:val="Ba"/>
-        <w:pBdr>
-          <w:top w:val="thinThickSmallGap" w:sz="18" w:space="1" w:color="auto"/>
-          <w:left w:val="thinThickSmallGap" w:sz="18" w:space="4" w:color="auto"/>
-          <w:bottom w:val="thickThinSmallGap" w:sz="18" w:space="1" w:color="auto"/>
-          <w:right w:val="thickThinSmallGap" w:sz="18" w:space="4" w:color="auto"/>
-        </w:pBdr>
-        <w:tabs>
-          <w:tab w:val="left" w:pos="3870"/>
-          <w:tab w:val="center" w:pos="4320"/>
-          <w:tab w:val="right" w:pos="8640"/>
-        </w:tabs>
-        <w:spacing w:after="0"/>
-        <w:ind w:firstLine="2160"/>
+      <w:r>
         <w:rPr>
           <w:b/>
           <w:szCs w:val="26"/>
           <w:lang w:eastAsia="x-none"/>
         </w:rPr>
-      </w:pPr>
+        <w:t xml:space="preserve"> - </w:t>
+      </w:r>
       <w:r>
         <w:rPr>
           <w:b/>
@@ -734,41 +719,11 @@
         </w:tabs>
         <w:spacing w:after="0"/>
         <w:rPr>
+          <w:b/>
           <w:szCs w:val="26"/>
           <w:lang w:eastAsia="x-none"/>
         </w:rPr>
       </w:pPr>
-      <w:r>
-        <w:rPr>
-          <w:szCs w:val="26"/>
-          <w:lang w:eastAsia="x-none"/>
-        </w:rPr>
-        <w:t xml:space="preserve">MÃ LỚP: </w:t>
-      </w:r>
-      <w:r>
-        <w:rPr>
-          <w:b/>
-          <w:szCs w:val="26"/>
-          <w:lang w:eastAsia="x-none"/>
-        </w:rPr>
-        <w:t>12523</w:t>
-      </w:r>
-      <w:r>
-        <w:rPr>
-          <w:b/>
-          <w:szCs w:val="26"/>
-          <w:lang w:eastAsia="x-none"/>
-        </w:rPr>
-        <w:t>W.</w:t>
-      </w:r>
-      <w:r>
-        <w:rPr>
-          <w:b/>
-          <w:szCs w:val="26"/>
-          <w:lang w:eastAsia="x-none"/>
-        </w:rPr>
-        <w:t>2</w:t>
-      </w:r>
     </w:p>
     <w:p>
       <w:pPr>
@@ -787,6 +742,78 @@
         <w:rPr>
           <w:b/>
           <w:szCs w:val="26"/>
+          <w:lang w:eastAsia="x-none"/>
+        </w:rPr>
+      </w:pPr>
+      <w:r>
+        <w:rPr>
+          <w:szCs w:val="26"/>
+          <w:lang w:eastAsia="x-none"/>
+        </w:rPr>
+        <w:t xml:space="preserve">MÃ LỚP: </w:t>
+      </w:r>
+      <w:r>
+        <w:rPr>
+          <w:b/>
+          <w:szCs w:val="26"/>
+          <w:lang w:eastAsia="x-none"/>
+        </w:rPr>
+        <w:t>12523</w:t>
+      </w:r>
+      <w:r>
+        <w:rPr>
+          <w:b/>
+          <w:szCs w:val="26"/>
+          <w:lang w:eastAsia="x-none"/>
+        </w:rPr>
+        <w:t>W.</w:t>
+      </w:r>
+      <w:r>
+        <w:rPr>
+          <w:b/>
+          <w:szCs w:val="26"/>
+          <w:lang w:eastAsia="x-none"/>
+        </w:rPr>
+        <w:t>2</w:t>
+      </w:r>
+    </w:p>
+    <w:p>
+      <w:pPr>
+        <w:pStyle w:val="Ba"/>
+        <w:pBdr>
+          <w:top w:val="thinThickSmallGap" w:sz="18" w:space="1" w:color="auto"/>
+          <w:left w:val="thinThickSmallGap" w:sz="18" w:space="4" w:color="auto"/>
+          <w:bottom w:val="thickThinSmallGap" w:sz="18" w:space="1" w:color="auto"/>
+          <w:right w:val="thickThinSmallGap" w:sz="18" w:space="4" w:color="auto"/>
+        </w:pBdr>
+        <w:tabs>
+          <w:tab w:val="center" w:pos="4320"/>
+          <w:tab w:val="right" w:pos="8640"/>
+        </w:tabs>
+        <w:spacing w:after="0"/>
+        <w:rPr>
+          <w:szCs w:val="26"/>
+          <w:lang w:eastAsia="x-none"/>
+        </w:rPr>
+      </w:pPr>
+    </w:p>
+    <w:p>
+      <w:pPr>
+        <w:pStyle w:val="Ba"/>
+        <w:pBdr>
+          <w:top w:val="thinThickSmallGap" w:sz="18" w:space="1" w:color="auto"/>
+          <w:left w:val="thinThickSmallGap" w:sz="18" w:space="4" w:color="auto"/>
+          <w:bottom w:val="thickThinSmallGap" w:sz="18" w:space="1" w:color="auto"/>
+          <w:right w:val="thickThinSmallGap" w:sz="18" w:space="4" w:color="auto"/>
+        </w:pBdr>
+        <w:tabs>
+          <w:tab w:val="center" w:pos="4320"/>
+          <w:tab w:val="right" w:pos="8640"/>
+        </w:tabs>
+        <w:spacing w:after="0"/>
+        <w:rPr>
+          <w:b/>
+          <w:szCs w:val="26"/>
           <w:lang w:val="vi-VN" w:eastAsia="x-none"/>
         </w:rPr>
       </w:pPr>
@@ -820,6 +847,160 @@
         </w:rPr>
         <w:t xml:space="preserve">GV NGUYỄN ĐỨC TUẤN ANH </w:t>
       </w:r>
+    </w:p>
+    <w:p>
+      <w:pPr>
+        <w:pStyle w:val="Ba"/>
+        <w:pBdr>
+          <w:top w:val="thinThickSmallGap" w:sz="18" w:space="1" w:color="auto"/>
+          <w:left w:val="thinThickSmallGap" w:sz="18" w:space="4" w:color="auto"/>
+          <w:bottom w:val="thickThinSmallGap" w:sz="18" w:space="1" w:color="auto"/>
+          <w:right w:val="thickThinSmallGap" w:sz="18" w:space="4" w:color="auto"/>
+        </w:pBdr>
+        <w:tabs>
+          <w:tab w:val="center" w:pos="4320"/>
+          <w:tab w:val="right" w:pos="8640"/>
+        </w:tabs>
+        <w:spacing w:after="0"/>
+        <w:rPr>
+          <w:b/>
+          <w:sz w:val="24"/>
+          <w:szCs w:val="26"/>
+          <w:lang w:eastAsia="x-none"/>
+        </w:rPr>
+      </w:pPr>
+    </w:p>
+    <w:p>
+      <w:pPr>
+        <w:pStyle w:val="Ba"/>
+        <w:pBdr>
+          <w:top w:val="thinThickSmallGap" w:sz="18" w:space="1" w:color="auto"/>
+          <w:left w:val="thinThickSmallGap" w:sz="18" w:space="4" w:color="auto"/>
+          <w:bottom w:val="thickThinSmallGap" w:sz="18" w:space="1" w:color="auto"/>
+          <w:right w:val="thickThinSmallGap" w:sz="18" w:space="4" w:color="auto"/>
+        </w:pBdr>
+        <w:tabs>
+          <w:tab w:val="center" w:pos="4320"/>
+          <w:tab w:val="right" w:pos="8640"/>
+        </w:tabs>
+        <w:spacing w:after="0"/>
+        <w:rPr>
+          <w:b/>
+          <w:sz w:val="24"/>
+          <w:szCs w:val="26"/>
+          <w:lang w:eastAsia="x-none"/>
+        </w:rPr>
+      </w:pPr>
+    </w:p>
+    <w:p>
+      <w:pPr>
+        <w:pStyle w:val="Ba"/>
+        <w:pBdr>
+          <w:top w:val="thinThickSmallGap" w:sz="18" w:space="1" w:color="auto"/>
+          <w:left w:val="thinThickSmallGap" w:sz="18" w:space="4" w:color="auto"/>
+          <w:bottom w:val="thickThinSmallGap" w:sz="18" w:space="1" w:color="auto"/>
+          <w:right w:val="thickThinSmallGap" w:sz="18" w:space="4" w:color="auto"/>
+        </w:pBdr>
+        <w:tabs>
+          <w:tab w:val="center" w:pos="4320"/>
+          <w:tab w:val="right" w:pos="8640"/>
+        </w:tabs>
+        <w:spacing w:after="0"/>
+        <w:rPr>
+          <w:b/>
+          <w:sz w:val="24"/>
+          <w:szCs w:val="26"/>
+          <w:lang w:eastAsia="x-none"/>
+        </w:rPr>
+      </w:pPr>
+    </w:p>
+    <w:p>
+      <w:pPr>
+        <w:pStyle w:val="Ba"/>
+        <w:pBdr>
+          <w:top w:val="thinThickSmallGap" w:sz="18" w:space="1" w:color="auto"/>
+          <w:left w:val="thinThickSmallGap" w:sz="18" w:space="4" w:color="auto"/>
+          <w:bottom w:val="thickThinSmallGap" w:sz="18" w:space="1" w:color="auto"/>
+          <w:right w:val="thickThinSmallGap" w:sz="18" w:space="4" w:color="auto"/>
+        </w:pBdr>
+        <w:tabs>
+          <w:tab w:val="center" w:pos="4320"/>
+          <w:tab w:val="right" w:pos="8640"/>
+        </w:tabs>
+        <w:spacing w:after="0"/>
+        <w:rPr>
+          <w:b/>
+          <w:sz w:val="24"/>
+          <w:szCs w:val="26"/>
+          <w:lang w:eastAsia="x-none"/>
+        </w:rPr>
+      </w:pPr>
+    </w:p>
+    <w:p>
+      <w:pPr>
+        <w:pStyle w:val="Ba"/>
+        <w:pBdr>
+          <w:top w:val="thinThickSmallGap" w:sz="18" w:space="1" w:color="auto"/>
+          <w:left w:val="thinThickSmallGap" w:sz="18" w:space="4" w:color="auto"/>
+          <w:bottom w:val="thickThinSmallGap" w:sz="18" w:space="1" w:color="auto"/>
+          <w:right w:val="thickThinSmallGap" w:sz="18" w:space="4" w:color="auto"/>
+        </w:pBdr>
+        <w:tabs>
+          <w:tab w:val="center" w:pos="4320"/>
+          <w:tab w:val="right" w:pos="8640"/>
+        </w:tabs>
+        <w:spacing w:after="0"/>
+        <w:rPr>
+          <w:b/>
+          <w:sz w:val="24"/>
+          <w:szCs w:val="26"/>
+          <w:lang w:eastAsia="x-none"/>
+        </w:rPr>
+      </w:pPr>
+    </w:p>
+    <w:p>
+      <w:pPr>
+        <w:pStyle w:val="Ba"/>
+        <w:pBdr>
+          <w:top w:val="thinThickSmallGap" w:sz="18" w:space="1" w:color="auto"/>
+          <w:left w:val="thinThickSmallGap" w:sz="18" w:space="4" w:color="auto"/>
+          <w:bottom w:val="thickThinSmallGap" w:sz="18" w:space="1" w:color="auto"/>
+          <w:right w:val="thickThinSmallGap" w:sz="18" w:space="4" w:color="auto"/>
+        </w:pBdr>
+        <w:tabs>
+          <w:tab w:val="center" w:pos="4320"/>
+          <w:tab w:val="right" w:pos="8640"/>
+        </w:tabs>
+        <w:spacing w:after="0"/>
+        <w:rPr>
+          <w:b/>
+          <w:sz w:val="24"/>
+          <w:szCs w:val="26"/>
+          <w:lang w:eastAsia="x-none"/>
+        </w:rPr>
+      </w:pPr>
+    </w:p>
+    <w:p>
+      <w:pPr>
+        <w:pStyle w:val="Ba"/>
+        <w:pBdr>
+          <w:top w:val="thinThickSmallGap" w:sz="18" w:space="1" w:color="auto"/>
+          <w:left w:val="thinThickSmallGap" w:sz="18" w:space="4" w:color="auto"/>
+          <w:bottom w:val="thickThinSmallGap" w:sz="18" w:space="1" w:color="auto"/>
+          <w:right w:val="thickThinSmallGap" w:sz="18" w:space="4" w:color="auto"/>
+        </w:pBdr>
+        <w:tabs>
+          <w:tab w:val="center" w:pos="4320"/>
+          <w:tab w:val="right" w:pos="8640"/>
+        </w:tabs>
+        <w:spacing w:after="0"/>
+        <w:rPr>
+          <w:b/>
+          <w:sz w:val="24"/>
+          <w:szCs w:val="26"/>
+          <w:lang w:eastAsia="x-none"/>
+        </w:rPr>
+      </w:pPr>
     </w:p>
     <w:p>
       <w:pPr>
@@ -1494,7 +1675,7 @@
     <w:p>
       <w:pPr>
         <w:spacing w:line="276" w:lineRule="auto"/>
-        <w:ind w:left="1" w:firstLine="719"/>
+        <w:ind w:left="1" w:firstLine="359"/>
         <w:jc w:val="both"/>
         <w:rPr>
           <w:szCs w:val="26"/>
@@ -1557,6 +1738,12 @@
           <w:szCs w:val="26"/>
         </w:rPr>
         <w:t>nhóm</w:t>
+      </w:r>
+      <w:r>
+        <w:rPr>
+          <w:szCs w:val="26"/>
+        </w:rPr>
+        <w:t xml:space="preserve"> bọn em</w:t>
       </w:r>
       <w:r>
         <w:rPr>
@@ -1571,22 +1758,32 @@
         <w:ind w:left="16"/>
         <w:jc w:val="right"/>
         <w:rPr>
+          <w:szCs w:val="26"/>
+        </w:rPr>
+      </w:pPr>
+      <w:r>
+        <w:rPr>
+          <w:szCs w:val="26"/>
+        </w:rPr>
+        <w:tab/>
+      </w:r>
+      <w:r>
+        <w:rPr>
+          <w:szCs w:val="26"/>
+        </w:rPr>
+        <w:tab/>
+      </w:r>
+    </w:p>
+    <w:p>
+      <w:pPr>
+        <w:spacing w:line="276" w:lineRule="auto"/>
+        <w:ind w:left="16"/>
+        <w:jc w:val="right"/>
+        <w:rPr>
           <w:i/>
           <w:szCs w:val="26"/>
         </w:rPr>
       </w:pPr>
-      <w:r>
-        <w:rPr>
-          <w:szCs w:val="26"/>
-        </w:rPr>
-        <w:tab/>
-      </w:r>
-      <w:r>
-        <w:rPr>
-          <w:szCs w:val="26"/>
-        </w:rPr>
-        <w:tab/>
-      </w:r>
       <w:r>
         <w:rPr>
           <w:i/>
@@ -1861,7 +2058,7 @@
     <w:p>
       <w:pPr>
         <w:spacing w:line="276" w:lineRule="auto"/>
-        <w:ind w:left="1" w:firstLine="719"/>
+        <w:ind w:left="1" w:firstLine="359"/>
         <w:jc w:val="both"/>
         <w:rPr>
           <w:szCs w:val="26"/>
@@ -1905,7 +2102,7 @@
     <w:p>
       <w:pPr>
         <w:spacing w:line="276" w:lineRule="auto"/>
-        <w:ind w:firstLine="720"/>
+        <w:ind w:firstLine="360"/>
         <w:jc w:val="both"/>
         <w:rPr>
           <w:szCs w:val="26"/>
@@ -2013,7 +2210,7 @@
     <w:p>
       <w:pPr>
         <w:spacing w:line="276" w:lineRule="auto"/>
-        <w:ind w:left="1" w:firstLine="719"/>
+        <w:ind w:left="1" w:firstLine="359"/>
         <w:jc w:val="both"/>
         <w:rPr>
           <w:szCs w:val="26"/>
@@ -4424,7 +4621,6 @@
                 <w:tab w:val="left" w:pos="627"/>
               </w:tabs>
               <w:spacing w:line="276" w:lineRule="auto"/>
-              <w:jc w:val="center"/>
               <w:rPr>
                 <w:szCs w:val="26"/>
               </w:rPr>
@@ -4432,8 +4628,6 @@
             <w:r>
               <w:rPr>
                 <w:rStyle w:val="ng-star-inserted"/>
-                <w:b/>
-                <w:bCs/>
                 <w:color w:val="1B1B1E"/>
                 <w:szCs w:val="26"/>
               </w:rPr>
@@ -4452,7 +4646,6 @@
                 <w:tab w:val="left" w:pos="627"/>
               </w:tabs>
               <w:spacing w:line="276" w:lineRule="auto"/>
-              <w:jc w:val="center"/>
               <w:rPr>
                 <w:szCs w:val="26"/>
               </w:rPr>
@@ -4460,8 +4653,6 @@
             <w:r>
               <w:rPr>
                 <w:rStyle w:val="ng-star-inserted"/>
-                <w:b/>
-                <w:bCs/>
                 <w:color w:val="1B1B1E"/>
                 <w:szCs w:val="26"/>
               </w:rPr>
@@ -4480,7 +4671,6 @@
                 <w:tab w:val="left" w:pos="627"/>
               </w:tabs>
               <w:spacing w:line="276" w:lineRule="auto"/>
-              <w:jc w:val="center"/>
               <w:rPr>
                 <w:szCs w:val="26"/>
               </w:rPr>
@@ -4533,7 +4723,6 @@
                 <w:tab w:val="left" w:pos="627"/>
               </w:tabs>
               <w:spacing w:line="276" w:lineRule="auto"/>
-              <w:jc w:val="center"/>
               <w:rPr>
                 <w:szCs w:val="26"/>
               </w:rPr>
@@ -4541,8 +4730,6 @@
             <w:r>
               <w:rPr>
                 <w:rStyle w:val="ng-star-inserted"/>
-                <w:b/>
-                <w:bCs/>
                 <w:color w:val="1B1B1E"/>
                 <w:szCs w:val="26"/>
               </w:rPr>
@@ -4561,7 +4748,6 @@
                 <w:tab w:val="left" w:pos="627"/>
               </w:tabs>
               <w:spacing w:line="276" w:lineRule="auto"/>
-              <w:jc w:val="center"/>
               <w:rPr>
                 <w:szCs w:val="26"/>
               </w:rPr>
@@ -4569,8 +4755,6 @@
             <w:r>
               <w:rPr>
                 <w:rStyle w:val="ng-star-inserted"/>
-                <w:b/>
-                <w:bCs/>
                 <w:color w:val="1B1B1E"/>
                 <w:szCs w:val="26"/>
               </w:rPr>
@@ -4589,7 +4773,6 @@
                 <w:tab w:val="left" w:pos="627"/>
               </w:tabs>
               <w:spacing w:line="276" w:lineRule="auto"/>
-              <w:jc w:val="center"/>
               <w:rPr>
                 <w:szCs w:val="26"/>
               </w:rPr>
@@ -4642,7 +4825,6 @@
                 <w:tab w:val="left" w:pos="627"/>
               </w:tabs>
               <w:spacing w:line="276" w:lineRule="auto"/>
-              <w:jc w:val="center"/>
               <w:rPr>
                 <w:szCs w:val="26"/>
               </w:rPr>
@@ -4650,8 +4832,6 @@
             <w:r>
               <w:rPr>
                 <w:rStyle w:val="ng-star-inserted"/>
-                <w:b/>
-                <w:bCs/>
                 <w:color w:val="1B1B1E"/>
                 <w:szCs w:val="26"/>
               </w:rPr>
@@ -4670,7 +4850,6 @@
                 <w:tab w:val="left" w:pos="627"/>
               </w:tabs>
               <w:spacing w:line="276" w:lineRule="auto"/>
-              <w:jc w:val="center"/>
               <w:rPr>
                 <w:szCs w:val="26"/>
               </w:rPr>
@@ -4678,8 +4857,6 @@
             <w:r>
               <w:rPr>
                 <w:rStyle w:val="ng-star-inserted"/>
-                <w:b/>
-                <w:bCs/>
                 <w:color w:val="1B1B1E"/>
                 <w:szCs w:val="26"/>
               </w:rPr>
@@ -4698,7 +4875,6 @@
                 <w:tab w:val="left" w:pos="627"/>
               </w:tabs>
               <w:spacing w:line="276" w:lineRule="auto"/>
-              <w:jc w:val="center"/>
               <w:rPr>
                 <w:szCs w:val="26"/>
               </w:rPr>
@@ -4751,7 +4927,6 @@
                 <w:tab w:val="left" w:pos="627"/>
               </w:tabs>
               <w:spacing w:line="276" w:lineRule="auto"/>
-              <w:jc w:val="center"/>
               <w:rPr>
                 <w:szCs w:val="26"/>
               </w:rPr>
@@ -4759,8 +4934,6 @@
             <w:r>
               <w:rPr>
                 <w:rStyle w:val="ng-star-inserted"/>
-                <w:b/>
-                <w:bCs/>
                 <w:color w:val="1B1B1E"/>
                 <w:szCs w:val="26"/>
               </w:rPr>
@@ -4779,7 +4952,6 @@
                 <w:tab w:val="left" w:pos="627"/>
               </w:tabs>
               <w:spacing w:line="276" w:lineRule="auto"/>
-              <w:jc w:val="center"/>
               <w:rPr>
                 <w:szCs w:val="26"/>
               </w:rPr>
@@ -4787,8 +4959,6 @@
             <w:r>
               <w:rPr>
                 <w:rStyle w:val="ng-star-inserted"/>
-                <w:b/>
-                <w:bCs/>
                 <w:color w:val="1B1B1E"/>
                 <w:szCs w:val="26"/>
               </w:rPr>
@@ -4807,7 +4977,6 @@
                 <w:tab w:val="left" w:pos="627"/>
               </w:tabs>
               <w:spacing w:line="276" w:lineRule="auto"/>
-              <w:jc w:val="center"/>
               <w:rPr>
                 <w:szCs w:val="26"/>
               </w:rPr>
@@ -4860,7 +5029,6 @@
                 <w:tab w:val="left" w:pos="627"/>
               </w:tabs>
               <w:spacing w:line="276" w:lineRule="auto"/>
-              <w:jc w:val="center"/>
               <w:rPr>
                 <w:szCs w:val="26"/>
               </w:rPr>
@@ -4868,8 +5036,6 @@
             <w:r>
               <w:rPr>
                 <w:rStyle w:val="ng-star-inserted"/>
-                <w:b/>
-                <w:bCs/>
                 <w:color w:val="1B1B1E"/>
                 <w:szCs w:val="26"/>
               </w:rPr>
@@ -4888,7 +5054,6 @@
                 <w:tab w:val="left" w:pos="627"/>
               </w:tabs>
               <w:spacing w:line="276" w:lineRule="auto"/>
-              <w:jc w:val="center"/>
               <w:rPr>
                 <w:szCs w:val="26"/>
               </w:rPr>
@@ -4896,8 +5061,6 @@
             <w:r>
               <w:rPr>
                 <w:rStyle w:val="ng-star-inserted"/>
-                <w:b/>
-                <w:bCs/>
                 <w:color w:val="1B1B1E"/>
                 <w:szCs w:val="26"/>
               </w:rPr>
@@ -4916,7 +5079,6 @@
                 <w:tab w:val="left" w:pos="627"/>
               </w:tabs>
               <w:spacing w:line="276" w:lineRule="auto"/>
-              <w:jc w:val="center"/>
               <w:rPr>
                 <w:szCs w:val="26"/>
               </w:rPr>
@@ -4969,7 +5131,6 @@
                 <w:tab w:val="left" w:pos="627"/>
               </w:tabs>
               <w:spacing w:line="276" w:lineRule="auto"/>
-              <w:jc w:val="center"/>
               <w:rPr>
                 <w:szCs w:val="26"/>
               </w:rPr>
@@ -4977,8 +5138,6 @@
             <w:r>
               <w:rPr>
                 <w:rStyle w:val="ng-star-inserted"/>
-                <w:b/>
-                <w:bCs/>
                 <w:color w:val="1B1B1E"/>
                 <w:szCs w:val="26"/>
               </w:rPr>
@@ -4997,7 +5156,6 @@
                 <w:tab w:val="left" w:pos="627"/>
               </w:tabs>
               <w:spacing w:line="276" w:lineRule="auto"/>
-              <w:jc w:val="center"/>
               <w:rPr>
                 <w:szCs w:val="26"/>
               </w:rPr>
@@ -5005,8 +5163,6 @@
             <w:r>
               <w:rPr>
                 <w:rStyle w:val="ng-star-inserted"/>
-                <w:b/>
-                <w:bCs/>
                 <w:color w:val="1B1B1E"/>
                 <w:szCs w:val="26"/>
               </w:rPr>
@@ -5025,7 +5181,6 @@
                 <w:tab w:val="left" w:pos="627"/>
               </w:tabs>
               <w:spacing w:line="276" w:lineRule="auto"/>
-              <w:jc w:val="center"/>
               <w:rPr>
                 <w:szCs w:val="26"/>
               </w:rPr>
@@ -5066,6 +5221,621 @@
           </w:p>
         </w:tc>
       </w:tr>
+      <w:tr>
+        <w:tc>
+          <w:tcPr>
+            <w:tcW w:w="805" w:type="dxa"/>
+            <w:vAlign w:val="center"/>
+          </w:tcPr>
+          <w:p>
+            <w:pPr>
+              <w:tabs>
+                <w:tab w:val="left" w:pos="627"/>
+              </w:tabs>
+              <w:spacing w:line="276" w:lineRule="auto"/>
+              <w:rPr>
+                <w:rStyle w:val="ng-star-inserted"/>
+                <w:color w:val="1B1B1E"/>
+                <w:szCs w:val="26"/>
+              </w:rPr>
+            </w:pPr>
+            <w:r>
+              <w:rPr>
+                <w:rStyle w:val="ng-star-inserted"/>
+                <w:color w:val="1B1B1E"/>
+                <w:szCs w:val="26"/>
+              </w:rPr>
+              <w:t>7</w:t>
+            </w:r>
+          </w:p>
+        </w:tc>
+        <w:tc>
+          <w:tcPr>
+            <w:tcW w:w="1458" w:type="dxa"/>
+            <w:vAlign w:val="center"/>
+          </w:tcPr>
+          <w:p>
+            <w:pPr>
+              <w:tabs>
+                <w:tab w:val="left" w:pos="627"/>
+              </w:tabs>
+              <w:spacing w:line="276" w:lineRule="auto"/>
+              <w:rPr>
+                <w:rStyle w:val="ng-star-inserted"/>
+                <w:color w:val="1B1B1E"/>
+                <w:szCs w:val="26"/>
+              </w:rPr>
+            </w:pPr>
+            <w:r>
+              <w:rPr>
+                <w:szCs w:val="26"/>
+              </w:rPr>
+              <w:t>RMSE</w:t>
+            </w:r>
+          </w:p>
+        </w:tc>
+        <w:tc>
+          <w:tcPr>
+            <w:tcW w:w="2835" w:type="dxa"/>
+            <w:vAlign w:val="center"/>
+          </w:tcPr>
+          <w:p>
+            <w:pPr>
+              <w:tabs>
+                <w:tab w:val="left" w:pos="627"/>
+              </w:tabs>
+              <w:spacing w:line="276" w:lineRule="auto"/>
+              <w:rPr>
+                <w:rStyle w:val="ng-star-inserted"/>
+                <w:color w:val="1B1B1E"/>
+                <w:szCs w:val="26"/>
+              </w:rPr>
+            </w:pPr>
+            <w:r>
+              <w:rPr>
+                <w:szCs w:val="26"/>
+              </w:rPr>
+              <w:t>Root Mean Square Error</w:t>
+            </w:r>
+          </w:p>
+        </w:tc>
+        <w:tc>
+          <w:tcPr>
+            <w:tcW w:w="3958" w:type="dxa"/>
+            <w:vAlign w:val="center"/>
+          </w:tcPr>
+          <w:tbl>
+            <w:tblPr>
+              <w:tblW w:w="0" w:type="auto"/>
+              <w:tblCellSpacing w:w="15" w:type="dxa"/>
+              <w:tblCellMar>
+                <w:top w:w="15" w:type="dxa"/>
+                <w:left w:w="15" w:type="dxa"/>
+                <w:bottom w:w="15" w:type="dxa"/>
+                <w:right w:w="15" w:type="dxa"/>
+              </w:tblCellMar>
+              <w:tblLook w:val="04A0" w:firstRow="1" w:lastRow="0" w:firstColumn="1" w:lastColumn="0" w:noHBand="0" w:noVBand="1"/>
+            </w:tblPr>
+            <w:tblGrid>
+              <w:gridCol w:w="96"/>
+            </w:tblGrid>
+            <w:tr>
+              <w:trPr>
+                <w:tblCellSpacing w:w="15" w:type="dxa"/>
+              </w:trPr>
+              <w:tc>
+                <w:tcPr>
+                  <w:tcW w:w="0" w:type="auto"/>
+                  <w:vAlign w:val="center"/>
+                  <w:hideMark/>
+                </w:tcPr>
+                <w:p>
+                  <w:pPr>
+                    <w:spacing w:line="276" w:lineRule="auto"/>
+                    <w:rPr>
+                      <w:szCs w:val="26"/>
+                    </w:rPr>
+                  </w:pPr>
+                </w:p>
+              </w:tc>
+            </w:tr>
+          </w:tbl>
+          <w:p>
+            <w:pPr>
+              <w:spacing w:line="276" w:lineRule="auto"/>
+              <w:rPr>
+                <w:vanish/>
+                <w:szCs w:val="26"/>
+              </w:rPr>
+            </w:pPr>
+          </w:p>
+          <w:tbl>
+            <w:tblPr>
+              <w:tblW w:w="0" w:type="auto"/>
+              <w:tblCellSpacing w:w="15" w:type="dxa"/>
+              <w:tblCellMar>
+                <w:top w:w="15" w:type="dxa"/>
+                <w:left w:w="15" w:type="dxa"/>
+                <w:bottom w:w="15" w:type="dxa"/>
+                <w:right w:w="15" w:type="dxa"/>
+              </w:tblCellMar>
+              <w:tblLook w:val="04A0" w:firstRow="1" w:lastRow="0" w:firstColumn="1" w:lastColumn="0" w:noHBand="0" w:noVBand="1"/>
+            </w:tblPr>
+            <w:tblGrid>
+              <w:gridCol w:w="3742"/>
+            </w:tblGrid>
+            <w:tr>
+              <w:trPr>
+                <w:tblCellSpacing w:w="15" w:type="dxa"/>
+              </w:trPr>
+              <w:tc>
+                <w:tcPr>
+                  <w:tcW w:w="0" w:type="auto"/>
+                  <w:vAlign w:val="center"/>
+                  <w:hideMark/>
+                </w:tcPr>
+                <w:p>
+                  <w:pPr>
+                    <w:spacing w:line="276" w:lineRule="auto"/>
+                    <w:rPr>
+                      <w:szCs w:val="26"/>
+                    </w:rPr>
+                  </w:pPr>
+                  <w:r>
+                    <w:rPr>
+                      <w:szCs w:val="26"/>
+                    </w:rPr>
+                    <w:t>Căn bậc hai của sai số bình phương trung bình, metric đánh giá sai số của mô hình hồi quy.</w:t>
+                  </w:r>
+                </w:p>
+              </w:tc>
+            </w:tr>
+          </w:tbl>
+          <w:p>
+            <w:pPr>
+              <w:tabs>
+                <w:tab w:val="left" w:pos="627"/>
+              </w:tabs>
+              <w:spacing w:line="276" w:lineRule="auto"/>
+              <w:rPr>
+                <w:rStyle w:val="ng-star-inserted"/>
+                <w:color w:val="1B1B1E"/>
+                <w:szCs w:val="26"/>
+              </w:rPr>
+            </w:pPr>
+          </w:p>
+        </w:tc>
+      </w:tr>
+      <w:tr>
+        <w:tc>
+          <w:tcPr>
+            <w:tcW w:w="805" w:type="dxa"/>
+            <w:vAlign w:val="center"/>
+          </w:tcPr>
+          <w:p>
+            <w:pPr>
+              <w:tabs>
+                <w:tab w:val="left" w:pos="627"/>
+              </w:tabs>
+              <w:spacing w:line="276" w:lineRule="auto"/>
+              <w:rPr>
+                <w:rStyle w:val="ng-star-inserted"/>
+                <w:color w:val="1B1B1E"/>
+                <w:szCs w:val="26"/>
+              </w:rPr>
+            </w:pPr>
+            <w:r>
+              <w:rPr>
+                <w:rStyle w:val="ng-star-inserted"/>
+                <w:color w:val="1B1B1E"/>
+                <w:szCs w:val="26"/>
+              </w:rPr>
+              <w:t>8</w:t>
+            </w:r>
+          </w:p>
+        </w:tc>
+        <w:tc>
+          <w:tcPr>
+            <w:tcW w:w="1458" w:type="dxa"/>
+            <w:vAlign w:val="center"/>
+          </w:tcPr>
+          <w:p>
+            <w:pPr>
+              <w:tabs>
+                <w:tab w:val="left" w:pos="627"/>
+              </w:tabs>
+              <w:spacing w:line="276" w:lineRule="auto"/>
+              <w:rPr>
+                <w:rStyle w:val="ng-star-inserted"/>
+                <w:color w:val="1B1B1E"/>
+                <w:szCs w:val="26"/>
+              </w:rPr>
+            </w:pPr>
+            <w:r>
+              <w:rPr>
+                <w:szCs w:val="26"/>
+              </w:rPr>
+              <w:t>R²</w:t>
+            </w:r>
+          </w:p>
+        </w:tc>
+        <w:tc>
+          <w:tcPr>
+            <w:tcW w:w="2835" w:type="dxa"/>
+            <w:vAlign w:val="center"/>
+          </w:tcPr>
+          <w:p>
+            <w:pPr>
+              <w:tabs>
+                <w:tab w:val="left" w:pos="627"/>
+              </w:tabs>
+              <w:spacing w:line="276" w:lineRule="auto"/>
+              <w:rPr>
+                <w:rStyle w:val="ng-star-inserted"/>
+                <w:color w:val="1B1B1E"/>
+                <w:szCs w:val="26"/>
+              </w:rPr>
+            </w:pPr>
+            <w:r>
+              <w:rPr>
+                <w:szCs w:val="26"/>
+              </w:rPr>
+              <w:t>R-squared / Coefficient of Determination</w:t>
+            </w:r>
+          </w:p>
+        </w:tc>
+        <w:tc>
+          <w:tcPr>
+            <w:tcW w:w="3958" w:type="dxa"/>
+            <w:vAlign w:val="center"/>
+          </w:tcPr>
+          <w:p>
+            <w:pPr>
+              <w:tabs>
+                <w:tab w:val="left" w:pos="627"/>
+              </w:tabs>
+              <w:spacing w:line="276" w:lineRule="auto"/>
+              <w:rPr>
+                <w:rStyle w:val="ng-star-inserted"/>
+                <w:color w:val="1B1B1E"/>
+                <w:szCs w:val="26"/>
+              </w:rPr>
+            </w:pPr>
+            <w:r>
+              <w:rPr>
+                <w:szCs w:val="26"/>
+              </w:rPr>
+              <w:t>Hệ số xác định, đo mức độ mô hình giải thích được sự biến thiên của biến mục tiêu.</w:t>
+            </w:r>
+          </w:p>
+        </w:tc>
+      </w:tr>
+      <w:tr>
+        <w:tc>
+          <w:tcPr>
+            <w:tcW w:w="805" w:type="dxa"/>
+            <w:vAlign w:val="center"/>
+          </w:tcPr>
+          <w:p>
+            <w:pPr>
+              <w:tabs>
+                <w:tab w:val="left" w:pos="627"/>
+              </w:tabs>
+              <w:spacing w:line="276" w:lineRule="auto"/>
+              <w:rPr>
+                <w:rStyle w:val="ng-star-inserted"/>
+                <w:color w:val="1B1B1E"/>
+                <w:szCs w:val="26"/>
+              </w:rPr>
+            </w:pPr>
+            <w:r>
+              <w:rPr>
+                <w:rStyle w:val="ng-star-inserted"/>
+                <w:color w:val="1B1B1E"/>
+                <w:szCs w:val="26"/>
+              </w:rPr>
+              <w:t>9</w:t>
+            </w:r>
+          </w:p>
+        </w:tc>
+        <w:tc>
+          <w:tcPr>
+            <w:tcW w:w="1458" w:type="dxa"/>
+            <w:vAlign w:val="center"/>
+          </w:tcPr>
+          <w:p>
+            <w:pPr>
+              <w:tabs>
+                <w:tab w:val="left" w:pos="627"/>
+              </w:tabs>
+              <w:spacing w:line="276" w:lineRule="auto"/>
+              <w:rPr>
+                <w:rStyle w:val="ng-star-inserted"/>
+                <w:color w:val="1B1B1E"/>
+                <w:szCs w:val="26"/>
+              </w:rPr>
+            </w:pPr>
+            <w:r>
+              <w:rPr>
+                <w:szCs w:val="26"/>
+              </w:rPr>
+              <w:t>MSE</w:t>
+            </w:r>
+          </w:p>
+        </w:tc>
+        <w:tc>
+          <w:tcPr>
+            <w:tcW w:w="2835" w:type="dxa"/>
+            <w:vAlign w:val="center"/>
+          </w:tcPr>
+          <w:p>
+            <w:pPr>
+              <w:tabs>
+                <w:tab w:val="left" w:pos="627"/>
+              </w:tabs>
+              <w:spacing w:line="276" w:lineRule="auto"/>
+              <w:rPr>
+                <w:rStyle w:val="ng-star-inserted"/>
+                <w:color w:val="1B1B1E"/>
+                <w:szCs w:val="26"/>
+              </w:rPr>
+            </w:pPr>
+            <w:r>
+              <w:rPr>
+                <w:szCs w:val="26"/>
+              </w:rPr>
+              <w:t>Mean Squared Error</w:t>
+            </w:r>
+          </w:p>
+        </w:tc>
+        <w:tc>
+          <w:tcPr>
+            <w:tcW w:w="3958" w:type="dxa"/>
+            <w:vAlign w:val="center"/>
+          </w:tcPr>
+          <w:p>
+            <w:pPr>
+              <w:tabs>
+                <w:tab w:val="left" w:pos="627"/>
+              </w:tabs>
+              <w:spacing w:line="276" w:lineRule="auto"/>
+              <w:rPr>
+                <w:rStyle w:val="ng-star-inserted"/>
+                <w:color w:val="1B1B1E"/>
+                <w:szCs w:val="26"/>
+              </w:rPr>
+            </w:pPr>
+            <w:r>
+              <w:rPr>
+                <w:szCs w:val="26"/>
+              </w:rPr>
+              <w:t>Sai số bình phương trung bình, metric tính trung bình bình phương sai số giữa giá trị thực và giá trị dự đoán.</w:t>
+            </w:r>
+          </w:p>
+        </w:tc>
+      </w:tr>
+      <w:tr>
+        <w:tc>
+          <w:tcPr>
+            <w:tcW w:w="805" w:type="dxa"/>
+            <w:vAlign w:val="center"/>
+          </w:tcPr>
+          <w:p>
+            <w:pPr>
+              <w:tabs>
+                <w:tab w:val="left" w:pos="627"/>
+              </w:tabs>
+              <w:spacing w:line="276" w:lineRule="auto"/>
+              <w:rPr>
+                <w:rStyle w:val="ng-star-inserted"/>
+                <w:color w:val="1B1B1E"/>
+                <w:szCs w:val="26"/>
+              </w:rPr>
+            </w:pPr>
+            <w:r>
+              <w:rPr>
+                <w:rStyle w:val="ng-star-inserted"/>
+                <w:color w:val="1B1B1E"/>
+                <w:szCs w:val="26"/>
+              </w:rPr>
+              <w:t>1</w:t>
+            </w:r>
+            <w:r>
+              <w:rPr>
+                <w:rStyle w:val="ng-star-inserted"/>
+                <w:color w:val="1B1B1E"/>
+              </w:rPr>
+              <w:t>0</w:t>
+            </w:r>
+          </w:p>
+        </w:tc>
+        <w:tc>
+          <w:tcPr>
+            <w:tcW w:w="1458" w:type="dxa"/>
+            <w:vAlign w:val="center"/>
+          </w:tcPr>
+          <w:p>
+            <w:pPr>
+              <w:tabs>
+                <w:tab w:val="left" w:pos="627"/>
+              </w:tabs>
+              <w:spacing w:line="276" w:lineRule="auto"/>
+              <w:rPr>
+                <w:rStyle w:val="ng-star-inserted"/>
+                <w:color w:val="1B1B1E"/>
+                <w:szCs w:val="26"/>
+              </w:rPr>
+            </w:pPr>
+            <w:r>
+              <w:rPr>
+                <w:szCs w:val="26"/>
+              </w:rPr>
+              <w:t>DB</w:t>
+            </w:r>
+          </w:p>
+        </w:tc>
+        <w:tc>
+          <w:tcPr>
+            <w:tcW w:w="2835" w:type="dxa"/>
+            <w:vAlign w:val="center"/>
+          </w:tcPr>
+          <w:p>
+            <w:pPr>
+              <w:tabs>
+                <w:tab w:val="left" w:pos="627"/>
+              </w:tabs>
+              <w:spacing w:line="276" w:lineRule="auto"/>
+              <w:rPr>
+                <w:rStyle w:val="ng-star-inserted"/>
+                <w:color w:val="1B1B1E"/>
+                <w:szCs w:val="26"/>
+              </w:rPr>
+            </w:pPr>
+            <w:r>
+              <w:rPr>
+                <w:szCs w:val="26"/>
+              </w:rPr>
+              <w:t>Database</w:t>
+            </w:r>
+          </w:p>
+        </w:tc>
+        <w:tc>
+          <w:tcPr>
+            <w:tcW w:w="3958" w:type="dxa"/>
+            <w:vAlign w:val="center"/>
+          </w:tcPr>
+          <w:p>
+            <w:pPr>
+              <w:tabs>
+                <w:tab w:val="left" w:pos="627"/>
+              </w:tabs>
+              <w:spacing w:line="276" w:lineRule="auto"/>
+              <w:rPr>
+                <w:rStyle w:val="ng-star-inserted"/>
+                <w:color w:val="1B1B1E"/>
+                <w:szCs w:val="26"/>
+              </w:rPr>
+            </w:pPr>
+            <w:r>
+              <w:rPr>
+                <w:szCs w:val="26"/>
+              </w:rPr>
+              <w:t>Cơ sở dữ liệu, nơi lưu trữ và quản lý dữ liệu của hệ thống.</w:t>
+            </w:r>
+          </w:p>
+        </w:tc>
+      </w:tr>
+      <w:tr>
+        <w:tc>
+          <w:tcPr>
+            <w:tcW w:w="805" w:type="dxa"/>
+            <w:vAlign w:val="center"/>
+          </w:tcPr>
+          <w:p>
+            <w:pPr>
+              <w:tabs>
+                <w:tab w:val="left" w:pos="627"/>
+              </w:tabs>
+              <w:spacing w:line="276" w:lineRule="auto"/>
+              <w:rPr>
+                <w:rStyle w:val="ng-star-inserted"/>
+                <w:color w:val="1B1B1E"/>
+                <w:szCs w:val="26"/>
+              </w:rPr>
+            </w:pPr>
+            <w:r>
+              <w:rPr>
+                <w:rStyle w:val="ng-star-inserted"/>
+                <w:color w:val="1B1B1E"/>
+                <w:szCs w:val="26"/>
+              </w:rPr>
+              <w:t>1</w:t>
+            </w:r>
+            <w:r>
+              <w:rPr>
+                <w:rStyle w:val="ng-star-inserted"/>
+                <w:color w:val="1B1B1E"/>
+              </w:rPr>
+              <w:t>1</w:t>
+            </w:r>
+          </w:p>
+        </w:tc>
+        <w:tc>
+          <w:tcPr>
+            <w:tcW w:w="1458" w:type="dxa"/>
+            <w:vAlign w:val="center"/>
+          </w:tcPr>
+          <w:p>
+            <w:pPr>
+              <w:tabs>
+                <w:tab w:val="left" w:pos="627"/>
+              </w:tabs>
+              <w:spacing w:line="276" w:lineRule="auto"/>
+              <w:rPr>
+                <w:rStyle w:val="ng-star-inserted"/>
+                <w:color w:val="1B1B1E"/>
+                <w:szCs w:val="26"/>
+              </w:rPr>
+            </w:pPr>
+            <w:r>
+              <w:rPr>
+                <w:szCs w:val="26"/>
+              </w:rPr>
+              <w:t>JSON</w:t>
+            </w:r>
+          </w:p>
+        </w:tc>
+        <w:tc>
+          <w:tcPr>
+            <w:tcW w:w="2835" w:type="dxa"/>
+            <w:vAlign w:val="center"/>
+          </w:tcPr>
+          <w:p>
+            <w:pPr>
+              <w:tabs>
+                <w:tab w:val="left" w:pos="627"/>
+              </w:tabs>
+              <w:spacing w:line="276" w:lineRule="auto"/>
+              <w:rPr>
+                <w:rStyle w:val="ng-star-inserted"/>
+                <w:color w:val="1B1B1E"/>
+                <w:szCs w:val="26"/>
+              </w:rPr>
+            </w:pPr>
+            <w:r>
+              <w:rPr>
+                <w:szCs w:val="26"/>
+              </w:rPr>
+              <w:t>JavaScript Object Notation</w:t>
+            </w:r>
+          </w:p>
+        </w:tc>
+        <w:tc>
+          <w:tcPr>
+            <w:tcW w:w="3958" w:type="dxa"/>
+            <w:vAlign w:val="center"/>
+          </w:tcPr>
+          <w:p>
+            <w:pPr>
+              <w:tabs>
+                <w:tab w:val="left" w:pos="627"/>
+              </w:tabs>
+              <w:spacing w:line="276" w:lineRule="auto"/>
+              <w:rPr>
+                <w:rStyle w:val="ng-star-inserted"/>
+                <w:color w:val="1B1B1E"/>
+                <w:szCs w:val="26"/>
+              </w:rPr>
+            </w:pPr>
+            <w:r>
+              <w:rPr>
+                <w:szCs w:val="26"/>
+              </w:rPr>
+              <w:t>Định dạng dữ liệu dạng văn bản thường được sử dụng để trao đổi dữ liệu giữa Frontend và Backend/API.</w:t>
+            </w:r>
+          </w:p>
+        </w:tc>
+      </w:tr>
     </w:tbl>
     <w:p>
       <w:pPr>
@@ -6052,6 +6822,7 @@
         <w:pStyle w:val="ng-star-inserted1"/>
         <w:shd w:val="clear" w:color="auto" w:fill="FFFFFF"/>
         <w:spacing w:after="270" w:line="276" w:lineRule="auto"/>
+        <w:ind w:firstLine="360"/>
         <w:jc w:val="both"/>
         <w:rPr>
           <w:rStyle w:val="ng-star-inserted"/>
@@ -6075,6 +6846,7 @@
         <w:pStyle w:val="ng-star-inserted1"/>
         <w:shd w:val="clear" w:color="auto" w:fill="FFFFFF"/>
         <w:spacing w:after="270" w:afterAutospacing="0" w:line="276" w:lineRule="auto"/>
+        <w:ind w:firstLine="360"/>
         <w:jc w:val="both"/>
         <w:rPr>
           <w:color w:val="1B1B1E"/>
@@ -6117,6 +6889,7 @@
       <w:pPr>
         <w:shd w:val="clear" w:color="auto" w:fill="FFFFFF" w:themeFill="background1"/>
         <w:spacing w:before="100" w:beforeAutospacing="1" w:line="276" w:lineRule="auto"/>
+        <w:ind w:firstLine="360"/>
         <w:jc w:val="both"/>
         <w:rPr>
           <w:color w:val="1B1B1E"/>
@@ -6137,6 +6910,7 @@
       <w:pPr>
         <w:shd w:val="clear" w:color="auto" w:fill="FFFFFF" w:themeFill="background1"/>
         <w:spacing w:before="100" w:beforeAutospacing="1" w:line="276" w:lineRule="auto"/>
+        <w:ind w:firstLine="360"/>
         <w:jc w:val="both"/>
         <w:rPr>
           <w:color w:val="1B1B1E"/>
@@ -6454,6 +7228,7 @@
       <w:pPr>
         <w:shd w:val="clear" w:color="auto" w:fill="FFFFFF" w:themeFill="background1"/>
         <w:spacing w:after="270" w:line="276" w:lineRule="auto"/>
+        <w:ind w:firstLine="360"/>
         <w:jc w:val="both"/>
         <w:rPr>
           <w:color w:val="1B1B1E"/>
@@ -6561,6 +7336,7 @@
       <w:pPr>
         <w:shd w:val="clear" w:color="auto" w:fill="FFFFFF" w:themeFill="background1"/>
         <w:spacing w:before="100" w:beforeAutospacing="1" w:line="276" w:lineRule="auto"/>
+        <w:ind w:firstLine="360"/>
         <w:jc w:val="both"/>
         <w:rPr>
           <w:color w:val="1B1B1E"/>
@@ -6605,6 +7381,7 @@
         <w:pStyle w:val="ng-star-inserted1"/>
         <w:shd w:val="clear" w:color="auto" w:fill="FFFFFF" w:themeFill="background1"/>
         <w:spacing w:after="270" w:afterAutospacing="0" w:line="276" w:lineRule="auto"/>
+        <w:ind w:firstLine="360"/>
         <w:jc w:val="both"/>
         <w:rPr>
           <w:sz w:val="26"/>
@@ -6845,6 +7622,7 @@
         <w:pStyle w:val="ng-star-inserted1"/>
         <w:shd w:val="clear" w:color="auto" w:fill="FFFFFF"/>
         <w:spacing w:after="270" w:afterAutospacing="0" w:line="276" w:lineRule="auto"/>
+        <w:ind w:firstLine="360"/>
         <w:jc w:val="both"/>
         <w:rPr>
           <w:color w:val="1B1B1E"/>
@@ -7277,6 +8055,7 @@
       <w:pPr>
         <w:shd w:val="clear" w:color="auto" w:fill="FFFFFF" w:themeFill="background1"/>
         <w:spacing w:after="270" w:line="276" w:lineRule="auto"/>
+        <w:ind w:firstLine="360"/>
         <w:jc w:val="both"/>
         <w:rPr>
           <w:color w:val="1B1B1E"/>
@@ -7315,6 +8094,7 @@
       <w:pPr>
         <w:shd w:val="clear" w:color="auto" w:fill="FFFFFF" w:themeFill="background1"/>
         <w:spacing w:before="100" w:beforeAutospacing="1" w:after="270" w:line="276" w:lineRule="auto"/>
+        <w:ind w:firstLine="360"/>
         <w:jc w:val="both"/>
         <w:rPr>
           <w:color w:val="1B1B1E"/>
@@ -7353,6 +8133,7 @@
       <w:pPr>
         <w:shd w:val="clear" w:color="auto" w:fill="FFFFFF" w:themeFill="background1"/>
         <w:spacing w:before="100" w:beforeAutospacing="1" w:line="276" w:lineRule="auto"/>
+        <w:ind w:firstLine="360"/>
         <w:jc w:val="both"/>
         <w:rPr>
           <w:color w:val="1B1B1E"/>
@@ -7546,6 +8327,7 @@
         <w:pStyle w:val="ng-star-inserted1"/>
         <w:shd w:val="clear" w:color="auto" w:fill="FFFFFF"/>
         <w:spacing w:after="270" w:afterAutospacing="0" w:line="276" w:lineRule="auto"/>
+        <w:ind w:firstLine="360"/>
         <w:jc w:val="both"/>
         <w:rPr>
           <w:color w:val="1B1B1E"/>
@@ -8214,9 +8996,6 @@
       </w:r>
       <w:bookmarkEnd w:id="16"/>
       <w:r>
-        <w:rPr>
-          <w:rStyle w:val="Ba"/>
-        </w:rPr>
         <w:t xml:space="preserve"> </w:t>
       </w:r>
       <w:r>
@@ -8287,16 +9066,7 @@
           <w:color w:val="1B1B1E"/>
           <w:szCs w:val="26"/>
         </w:rPr>
-        <w:t xml:space="preserve"> </w:t>
-      </w:r>
-      <w:r>
-        <w:rPr>
-          <w:rStyle w:val="ng-star-inserted"/>
-          <w:rFonts w:cs="Times New Roman"/>
-          <w:color w:val="1B1B1E"/>
-          <w:szCs w:val="26"/>
-        </w:rPr>
-        <w:t>Biểu đồ phân tán bmi vs charges theo smoker</w:t>
+        <w:t xml:space="preserve"> Biểu đồ phân tán bmi vs charges theo smoker</w:t>
       </w:r>
     </w:p>
     <w:p>
@@ -8460,13 +9230,7 @@
         <w:rPr>
           <w:rStyle w:val="ng-star-inserted"/>
         </w:rPr>
-        <w:t xml:space="preserve">Hình 4: </w:t>
-      </w:r>
-      <w:r>
-        <w:rPr>
-          <w:rStyle w:val="ng-star-inserted"/>
-        </w:rPr>
-        <w:t>Biểu đồ phân tán bmi vs charges theo smoker</w:t>
+        <w:t>Hình 4: Biểu đồ phân tán bmi vs charges theo smoker</w:t>
       </w:r>
       <w:bookmarkEnd w:id="19"/>
     </w:p>
@@ -8496,16 +9260,7 @@
           <w:color w:val="1B1B1E"/>
           <w:szCs w:val="26"/>
         </w:rPr>
-        <w:t>5</w:t>
-      </w:r>
-      <w:r>
-        <w:rPr>
-          <w:rStyle w:val="ng-star-inserted"/>
-          <w:rFonts w:cs="Times New Roman"/>
-          <w:color w:val="1B1B1E"/>
-          <w:szCs w:val="26"/>
-        </w:rPr>
-        <w:t xml:space="preserve"> :</w:t>
+        <w:t>5 :</w:t>
       </w:r>
       <w:proofErr w:type="gramEnd"/>
       <w:r>
@@ -8719,16 +9474,7 @@
           <w:color w:val="1B1B1E"/>
           <w:szCs w:val="26"/>
         </w:rPr>
-        <w:t>6</w:t>
-      </w:r>
-      <w:r>
-        <w:rPr>
-          <w:rStyle w:val="ng-star-inserted"/>
-          <w:rFonts w:cs="Times New Roman"/>
-          <w:color w:val="1B1B1E"/>
-          <w:szCs w:val="26"/>
-        </w:rPr>
-        <w:t xml:space="preserve"> :</w:t>
+        <w:t>6 :</w:t>
       </w:r>
       <w:proofErr w:type="gramEnd"/>
       <w:r>
@@ -8951,25 +9697,7 @@
           <w:color w:val="1B1B1E"/>
           <w:szCs w:val="26"/>
         </w:rPr>
-        <w:t xml:space="preserve">Biểu đồ </w:t>
-      </w:r>
-      <w:r>
-        <w:rPr>
-          <w:rStyle w:val="ng-star-inserted"/>
-          <w:rFonts w:cs="Times New Roman"/>
-          <w:color w:val="1B1B1E"/>
-          <w:szCs w:val="26"/>
-        </w:rPr>
-        <w:t xml:space="preserve">7: </w:t>
-      </w:r>
-      <w:r>
-        <w:rPr>
-          <w:rStyle w:val="ng-star-inserted"/>
-          <w:rFonts w:cs="Times New Roman"/>
-          <w:color w:val="1B1B1E"/>
-          <w:szCs w:val="26"/>
-        </w:rPr>
-        <w:t>Ma trận tương quan (Correlation Heatmap)</w:t>
+        <w:t>Biểu đồ 7: Ma trận tương quan (Correlation Heatmap)</w:t>
       </w:r>
     </w:p>
     <w:p>
@@ -9131,13 +9859,7 @@
       </w:pPr>
       <w:bookmarkStart w:id="22" w:name="_Toc241251909"/>
       <w:r>
-        <w:t xml:space="preserve">Hình </w:t>
-      </w:r>
-      <w:r>
-        <w:t>7</w:t>
-      </w:r>
-      <w:r>
-        <w:t xml:space="preserve">: </w:t>
+        <w:t xml:space="preserve">Hình 7: </w:t>
       </w:r>
       <w:r>
         <w:rPr>
@@ -9175,25 +9897,7 @@
           <w:color w:val="1B1B1E"/>
           <w:szCs w:val="26"/>
         </w:rPr>
-        <w:t xml:space="preserve">Biểu đồ </w:t>
-      </w:r>
-      <w:r>
-        <w:rPr>
-          <w:rStyle w:val="ng-star-inserted"/>
-          <w:rFonts w:cs="Times New Roman"/>
-          <w:color w:val="1B1B1E"/>
-          <w:szCs w:val="26"/>
-        </w:rPr>
-        <w:t>8</w:t>
-      </w:r>
-      <w:r>
-        <w:rPr>
-          <w:rStyle w:val="ng-star-inserted"/>
-          <w:rFonts w:cs="Times New Roman"/>
-          <w:color w:val="1B1B1E"/>
-          <w:szCs w:val="26"/>
-        </w:rPr>
-        <w:t>: Biểu đồ Violin của charges theo smoker và sex</w:t>
+        <w:t>Biểu đồ 8: Biểu đồ Violin của charges theo smoker và sex</w:t>
       </w:r>
     </w:p>
     <w:p>
@@ -9202,18 +9906,24 @@
         <w:spacing w:after="60"/>
         <w:rPr>
           <w:rFonts w:ascii="Times New Roman" w:hAnsi="Times New Roman" w:cs="Times New Roman"/>
+          <w:sz w:val="26"/>
+          <w:szCs w:val="26"/>
         </w:rPr>
       </w:pPr>
       <w:r>
         <w:rPr>
           <w:rFonts w:ascii="Times New Roman" w:hAnsi="Times New Roman" w:cs="Times New Roman"/>
           <w:b/>
+          <w:sz w:val="26"/>
+          <w:szCs w:val="26"/>
         </w:rPr>
         <w:t xml:space="preserve">Quan sát: </w:t>
       </w:r>
       <w:r>
         <w:rPr>
           <w:rFonts w:ascii="Times New Roman" w:hAnsi="Times New Roman" w:cs="Times New Roman"/>
+          <w:sz w:val="26"/>
+          <w:szCs w:val="26"/>
         </w:rPr>
         <w:t>Yếu tố giới tính (sex) không tạo ra sự phân tách biệt lập về chi phí trong từng nhóm hút thuốc.</w:t>
       </w:r>
@@ -9224,18 +9934,24 @@
         <w:spacing w:after="60"/>
         <w:rPr>
           <w:rFonts w:ascii="Times New Roman" w:hAnsi="Times New Roman" w:cs="Times New Roman"/>
+          <w:sz w:val="26"/>
+          <w:szCs w:val="26"/>
         </w:rPr>
       </w:pPr>
       <w:r>
         <w:rPr>
           <w:rFonts w:ascii="Times New Roman" w:hAnsi="Times New Roman" w:cs="Times New Roman"/>
           <w:b/>
+          <w:sz w:val="26"/>
+          <w:szCs w:val="26"/>
         </w:rPr>
         <w:t xml:space="preserve">Ý nghĩa: </w:t>
       </w:r>
       <w:r>
         <w:rPr>
           <w:rFonts w:ascii="Times New Roman" w:hAnsi="Times New Roman" w:cs="Times New Roman"/>
+          <w:sz w:val="26"/>
+          <w:szCs w:val="26"/>
         </w:rPr>
         <w:t>Chi phí tăng cao chủ yếu do hành vi hút thuốc quyết định, ít phụ thuộc vào giới tính.</w:t>
       </w:r>
@@ -9246,18 +9962,24 @@
         <w:spacing w:after="60"/>
         <w:rPr>
           <w:rFonts w:ascii="Times New Roman" w:hAnsi="Times New Roman" w:cs="Times New Roman"/>
+          <w:sz w:val="26"/>
+          <w:szCs w:val="26"/>
         </w:rPr>
       </w:pPr>
       <w:r>
         <w:rPr>
           <w:rFonts w:ascii="Times New Roman" w:hAnsi="Times New Roman" w:cs="Times New Roman"/>
           <w:b/>
+          <w:sz w:val="26"/>
+          <w:szCs w:val="26"/>
         </w:rPr>
         <w:t xml:space="preserve">Quyết định: </w:t>
       </w:r>
       <w:r>
         <w:rPr>
           <w:rFonts w:ascii="Times New Roman" w:hAnsi="Times New Roman" w:cs="Times New Roman"/>
+          <w:sz w:val="26"/>
+          <w:szCs w:val="26"/>
         </w:rPr>
         <w:t>Mã hóa One-Hot cho sex theo đúng Schema gốc của tập dữ liệu.</w:t>
       </w:r>
@@ -9352,15 +10074,7 @@
           <w:color w:val="1B1B1E"/>
           <w:szCs w:val="26"/>
         </w:rPr>
-        <w:t xml:space="preserve">Hình 8: </w:t>
-      </w:r>
-      <w:r>
-        <w:rPr>
-          <w:rStyle w:val="ng-star-inserted"/>
-          <w:color w:val="1B1B1E"/>
-          <w:szCs w:val="26"/>
-        </w:rPr>
-        <w:t>Biểu đồ Violin của charges theo smoker và sex</w:t>
+        <w:t>Hình 8: Biểu đồ Violin của charges theo smoker và sex</w:t>
       </w:r>
       <w:bookmarkEnd w:id="23"/>
     </w:p>
@@ -9409,21 +10123,80 @@
         <w:pStyle w:val="ng-star-inserted1"/>
         <w:shd w:val="clear" w:color="auto" w:fill="FFFFFF"/>
         <w:spacing w:after="270" w:afterAutospacing="0" w:line="276" w:lineRule="auto"/>
+        <w:ind w:firstLine="630"/>
         <w:jc w:val="both"/>
         <w:rPr>
-          <w:color w:val="1B1B1E"/>
-          <w:sz w:val="26"/>
-          <w:szCs w:val="26"/>
-        </w:rPr>
-      </w:pPr>
-      <w:r>
-        <w:rPr>
           <w:rStyle w:val="ng-star-inserted"/>
           <w:color w:val="1B1B1E"/>
           <w:sz w:val="26"/>
           <w:szCs w:val="26"/>
-        </w:rPr>
-        <w:t>Toàn bộ logic xử lý dữ liệu được đóng gói chuẩn mực trong ai-models/src/preprocess.py và thử nghiệm tại 02_preprocess.ipynb:</w:t>
+          <w:lang w:val="en-US"/>
+        </w:rPr>
+      </w:pPr>
+      <w:r>
+        <w:rPr>
+          <w:rStyle w:val="ng-star-inserted"/>
+          <w:color w:val="1B1B1E"/>
+          <w:sz w:val="26"/>
+          <w:szCs w:val="26"/>
+        </w:rPr>
+        <w:t>Toàn</w:t>
+      </w:r>
+      <w:r>
+        <w:rPr>
+          <w:rStyle w:val="ng-star-inserted"/>
+          <w:color w:val="1B1B1E"/>
+          <w:sz w:val="26"/>
+          <w:szCs w:val="26"/>
+          <w:lang w:val="en-US"/>
+        </w:rPr>
+        <w:t xml:space="preserve"> </w:t>
+      </w:r>
+      <w:r>
+        <w:rPr>
+          <w:rStyle w:val="ng-star-inserted"/>
+          <w:color w:val="1B1B1E"/>
+          <w:sz w:val="26"/>
+          <w:szCs w:val="26"/>
+        </w:rPr>
+        <w:t xml:space="preserve">bộ logic xử lý dữ liệu được đóng gói chuẩn mực trong </w:t>
+      </w:r>
+      <w:r>
+        <w:rPr>
+          <w:rStyle w:val="ng-star-inserted"/>
+          <w:color w:val="1B1B1E"/>
+          <w:sz w:val="26"/>
+          <w:szCs w:val="26"/>
+          <w:lang w:val="en-US"/>
+        </w:rPr>
+        <w:t>phần</w:t>
+      </w:r>
+    </w:p>
+    <w:p>
+      <w:pPr>
+        <w:pStyle w:val="ng-star-inserted1"/>
+        <w:numPr>
+          <w:ilvl w:val="0"/>
+          <w:numId w:val="11"/>
+        </w:numPr>
+        <w:shd w:val="clear" w:color="auto" w:fill="FFFFFF"/>
+        <w:spacing w:after="270" w:afterAutospacing="0" w:line="276" w:lineRule="auto"/>
+        <w:ind w:left="630"/>
+        <w:jc w:val="both"/>
+        <w:rPr>
+          <w:color w:val="1B1B1E"/>
+          <w:sz w:val="26"/>
+          <w:szCs w:val="26"/>
+        </w:rPr>
+      </w:pPr>
+      <w:r>
+        <w:rPr>
+          <w:rStyle w:val="ng-star-inserted"/>
+          <w:color w:val="1B1B1E"/>
+          <w:sz w:val="26"/>
+          <w:szCs w:val="26"/>
+        </w:rPr>
+        <w:t>ai-models/src/preprocess.py và thử nghiệm tại 02_preprocess.ipynb:</w:t>
       </w:r>
     </w:p>
     <w:p>
@@ -10254,6 +11027,7 @@
       <w:pPr>
         <w:shd w:val="clear" w:color="auto" w:fill="FFFFFF" w:themeFill="background1"/>
         <w:spacing w:after="270" w:line="276" w:lineRule="auto"/>
+        <w:ind w:firstLine="360"/>
         <w:jc w:val="both"/>
         <w:rPr>
           <w:color w:val="1B1B1E"/>
@@ -10287,6 +11061,7 @@
       <w:pPr>
         <w:shd w:val="clear" w:color="auto" w:fill="FFFFFF" w:themeFill="background1"/>
         <w:spacing w:before="100" w:beforeAutospacing="1" w:after="270" w:line="276" w:lineRule="auto"/>
+        <w:ind w:firstLine="360"/>
         <w:jc w:val="both"/>
         <w:rPr>
           <w:color w:val="313334"/>
@@ -12371,6 +13146,7 @@
         <w:pStyle w:val="ng-star-inserted1"/>
         <w:shd w:val="clear" w:color="auto" w:fill="FFFFFF"/>
         <w:spacing w:after="270" w:afterAutospacing="0" w:line="276" w:lineRule="auto"/>
+        <w:ind w:firstLine="360"/>
         <w:jc w:val="both"/>
         <w:rPr>
           <w:color w:val="1B1B1E"/>
@@ -12637,6 +13413,7 @@
         <w:pStyle w:val="ng-star-inserted1"/>
         <w:shd w:val="clear" w:color="auto" w:fill="FFFFFF"/>
         <w:spacing w:after="270" w:afterAutospacing="0" w:line="276" w:lineRule="auto"/>
+        <w:ind w:firstLine="360"/>
         <w:jc w:val="both"/>
         <w:rPr>
           <w:color w:val="1B1B1E"/>
@@ -12738,6 +13515,7 @@
         <w:pStyle w:val="ng-star-inserted1"/>
         <w:shd w:val="clear" w:color="auto" w:fill="FFFFFF"/>
         <w:spacing w:after="270" w:afterAutospacing="0" w:line="276" w:lineRule="auto"/>
+        <w:ind w:firstLine="360"/>
         <w:jc w:val="both"/>
         <w:rPr>
           <w:color w:val="1B1B1E"/>
@@ -12926,6 +13704,7 @@
       </w:pPr>
       <w:r>
         <w:rPr>
+          <w:noProof/>
           <w:color w:val="1B1B1E"/>
           <w:sz w:val="26"/>
           <w:szCs w:val="26"/>
@@ -13399,18 +14178,21 @@
           <w:p>
             <w:pPr>
               <w:spacing w:line="276" w:lineRule="auto"/>
+              <w:rPr>
+                <w:szCs w:val="26"/>
+              </w:rPr>
             </w:pPr>
             <w:r>
               <w:rPr>
                 <w:b/>
-                <w:sz w:val="19"/>
+                <w:szCs w:val="26"/>
               </w:rPr>
               <w:t>Đào Văn Khiêm</w:t>
             </w:r>
             <w:r>
               <w:rPr>
                 <w:b/>
-                <w:sz w:val="19"/>
+                <w:szCs w:val="26"/>
               </w:rPr>
               <w:br/>
               <w:t>(MSSV: 10123189)</w:t>
@@ -13431,10 +14213,13 @@
           <w:p>
             <w:pPr>
               <w:spacing w:line="276" w:lineRule="auto"/>
+              <w:rPr>
+                <w:szCs w:val="26"/>
+              </w:rPr>
             </w:pPr>
             <w:r>
               <w:rPr>
-                <w:sz w:val="19"/>
+                <w:szCs w:val="26"/>
               </w:rPr>
               <w:t>ML Nền tảng &amp; AI Service</w:t>
             </w:r>
@@ -13454,51 +14239,54 @@
           <w:p>
             <w:pPr>
               <w:spacing w:line="276" w:lineRule="auto"/>
+              <w:rPr>
+                <w:szCs w:val="26"/>
+              </w:rPr>
             </w:pPr>
             <w:r>
               <w:rPr>
-                <w:sz w:val="19"/>
+                <w:szCs w:val="26"/>
               </w:rPr>
               <w:t>• EDA &amp; Biểu đồ: eda.py, 01_</w:t>
             </w:r>
             <w:proofErr w:type="gramStart"/>
             <w:r>
               <w:rPr>
-                <w:sz w:val="19"/>
+                <w:szCs w:val="26"/>
               </w:rPr>
               <w:t>eda.ipynb</w:t>
             </w:r>
             <w:proofErr w:type="gramEnd"/>
             <w:r>
               <w:rPr>
-                <w:sz w:val="19"/>
+                <w:szCs w:val="26"/>
               </w:rPr>
               <w:t>, docs/figures/</w:t>
             </w:r>
             <w:r>
               <w:rPr>
-                <w:sz w:val="19"/>
+                <w:szCs w:val="26"/>
               </w:rPr>
               <w:br/>
               <w:t>• Preprocessing: preprocess.py, 02_preprocess.ipynb</w:t>
             </w:r>
             <w:r>
               <w:rPr>
-                <w:sz w:val="19"/>
+                <w:szCs w:val="26"/>
               </w:rPr>
               <w:br/>
               <w:t>• Model: Linear Regression, Decision Tree (GridSearchCV)</w:t>
             </w:r>
             <w:r>
               <w:rPr>
-                <w:sz w:val="19"/>
+                <w:szCs w:val="26"/>
               </w:rPr>
               <w:br/>
               <w:t>• AI Service API: ai-models/service/, pytest</w:t>
             </w:r>
             <w:r>
               <w:rPr>
-                <w:sz w:val="19"/>
+                <w:szCs w:val="26"/>
               </w:rPr>
               <w:br/>
               <w:t>• Báo cáo: 50% (Phần Dữ liệu + EDA + Model)</w:t>
@@ -13548,18 +14336,21 @@
           <w:p>
             <w:pPr>
               <w:spacing w:line="276" w:lineRule="auto"/>
+              <w:rPr>
+                <w:szCs w:val="26"/>
+              </w:rPr>
             </w:pPr>
             <w:r>
               <w:rPr>
                 <w:b/>
-                <w:sz w:val="19"/>
+                <w:szCs w:val="26"/>
               </w:rPr>
               <w:t>Nguyễn Trọng Phương</w:t>
             </w:r>
             <w:r>
               <w:rPr>
                 <w:b/>
-                <w:sz w:val="19"/>
+                <w:szCs w:val="26"/>
               </w:rPr>
               <w:br/>
               <w:t>(MSSV: 10123262)</w:t>
@@ -13580,10 +14371,13 @@
           <w:p>
             <w:pPr>
               <w:spacing w:line="276" w:lineRule="auto"/>
+              <w:rPr>
+                <w:szCs w:val="26"/>
+              </w:rPr>
             </w:pPr>
             <w:r>
               <w:rPr>
-                <w:sz w:val="19"/>
+                <w:szCs w:val="26"/>
               </w:rPr>
               <w:t>Model Nâng cao &amp; Web App</w:t>
             </w:r>
@@ -13603,51 +14397,54 @@
           <w:p>
             <w:pPr>
               <w:spacing w:line="276" w:lineRule="auto"/>
+              <w:rPr>
+                <w:szCs w:val="26"/>
+              </w:rPr>
             </w:pPr>
             <w:r>
               <w:rPr>
-                <w:sz w:val="19"/>
+                <w:szCs w:val="26"/>
               </w:rPr>
               <w:t>• Model: Random Forest, SVR (GridSearchCV, evaluate.py, 04_</w:t>
             </w:r>
             <w:proofErr w:type="gramStart"/>
             <w:r>
               <w:rPr>
-                <w:sz w:val="19"/>
+                <w:szCs w:val="26"/>
               </w:rPr>
               <w:t>evaluate.ipynb</w:t>
             </w:r>
             <w:proofErr w:type="gramEnd"/>
             <w:r>
               <w:rPr>
-                <w:sz w:val="19"/>
+                <w:szCs w:val="26"/>
               </w:rPr>
               <w:t>)</w:t>
             </w:r>
             <w:r>
               <w:rPr>
-                <w:sz w:val="19"/>
+                <w:szCs w:val="26"/>
               </w:rPr>
               <w:br/>
               <w:t>• Backend: app/backend/ (Validate schema, MongoDB, pytest)</w:t>
             </w:r>
             <w:r>
               <w:rPr>
-                <w:sz w:val="19"/>
+                <w:szCs w:val="26"/>
               </w:rPr>
               <w:br/>
               <w:t>• Frontend: app/frontend/ (Form động, API)</w:t>
             </w:r>
             <w:r>
               <w:rPr>
-                <w:sz w:val="19"/>
+                <w:szCs w:val="26"/>
               </w:rPr>
               <w:br/>
               <w:t>• Docker/Deploy: docker-compose.yml, Dockerfiles, tunnel</w:t>
             </w:r>
             <w:r>
               <w:rPr>
-                <w:sz w:val="19"/>
+                <w:szCs w:val="26"/>
               </w:rPr>
               <w:br/>
               <w:t>• Báo cáo: 50% (Phần Kiến trúc + Triển khai + Test)</w:t>
@@ -13697,18 +14494,21 @@
           <w:p>
             <w:pPr>
               <w:spacing w:line="276" w:lineRule="auto"/>
+              <w:rPr>
+                <w:szCs w:val="26"/>
+              </w:rPr>
             </w:pPr>
             <w:r>
               <w:rPr>
                 <w:b/>
-                <w:sz w:val="19"/>
+                <w:szCs w:val="26"/>
               </w:rPr>
               <w:t>Cả nhóm</w:t>
             </w:r>
             <w:r>
               <w:rPr>
                 <w:b/>
-                <w:sz w:val="19"/>
+                <w:szCs w:val="26"/>
               </w:rPr>
               <w:br/>
               <w:t>(Co-working)</w:t>
@@ -13729,10 +14529,13 @@
           <w:p>
             <w:pPr>
               <w:spacing w:line="276" w:lineRule="auto"/>
+              <w:rPr>
+                <w:szCs w:val="26"/>
+              </w:rPr>
             </w:pPr>
             <w:r>
               <w:rPr>
-                <w:sz w:val="19"/>
+                <w:szCs w:val="26"/>
               </w:rPr>
               <w:t>Tích hợp &amp; Đánh giá</w:t>
             </w:r>
@@ -13752,23 +14555,26 @@
           <w:p>
             <w:pPr>
               <w:spacing w:line="276" w:lineRule="auto"/>
+              <w:rPr>
+                <w:szCs w:val="26"/>
+              </w:rPr>
             </w:pPr>
             <w:r>
               <w:rPr>
-                <w:sz w:val="19"/>
+                <w:szCs w:val="26"/>
               </w:rPr>
               <w:t>• Slide thuyết trình (slide.pptx) — Mỗi người 50%</w:t>
             </w:r>
             <w:r>
               <w:rPr>
-                <w:sz w:val="19"/>
+                <w:szCs w:val="26"/>
               </w:rPr>
               <w:br/>
               <w:t>• Chạy thử nghiệm hệ thống (docker compose up), Smoke test</w:t>
             </w:r>
             <w:r>
               <w:rPr>
-                <w:sz w:val="19"/>
+                <w:szCs w:val="26"/>
               </w:rPr>
               <w:br/>
               <w:t>• Hoàn thiện README.md &amp; Demo Online</w:t>
@@ -13867,61 +14673,6 @@
     </w:p>
     <w:p>
       <w:pPr>
-        <w:spacing w:line="276" w:lineRule="auto"/>
-      </w:pPr>
-    </w:p>
-    <w:p>
-      <w:pPr>
-        <w:spacing w:line="276" w:lineRule="auto"/>
-      </w:pPr>
-    </w:p>
-    <w:p>
-      <w:pPr>
-        <w:spacing w:line="276" w:lineRule="auto"/>
-      </w:pPr>
-    </w:p>
-    <w:p>
-      <w:pPr>
-        <w:spacing w:line="276" w:lineRule="auto"/>
-      </w:pPr>
-    </w:p>
-    <w:p>
-      <w:pPr>
-        <w:spacing w:line="276" w:lineRule="auto"/>
-      </w:pPr>
-    </w:p>
-    <w:p>
-      <w:pPr>
-        <w:spacing w:line="276" w:lineRule="auto"/>
-      </w:pPr>
-    </w:p>
-    <w:p>
-      <w:pPr>
-        <w:spacing w:line="276" w:lineRule="auto"/>
-      </w:pPr>
-    </w:p>
-    <w:p>
-      <w:pPr>
-        <w:spacing w:line="276" w:lineRule="auto"/>
-      </w:pPr>
-    </w:p>
-    <w:p>
-      <w:pPr>
-        <w:spacing w:line="276" w:lineRule="auto"/>
-      </w:pPr>
-    </w:p>
-    <w:p>
-      <w:pPr>
-        <w:spacing w:line="276" w:lineRule="auto"/>
-      </w:pPr>
-    </w:p>
-    <w:p>
-      <w:pPr>
-        <w:spacing w:line="276" w:lineRule="auto"/>
-      </w:pPr>
-    </w:p>
-    <w:p>
-      <w:pPr>
         <w:pStyle w:val="Heading1"/>
         <w:numPr>
           <w:ilvl w:val="0"/>
@@ -14004,6 +14755,18 @@
           <w:szCs w:val="26"/>
           <w:lang w:val="en-US"/>
         </w:rPr>
+        <w:t xml:space="preserve">        </w:t>
+      </w:r>
+      <w:r>
+        <w:rPr>
+          <w:rStyle w:val="ng-star-inserted"/>
+          <w:b/>
+          <w:bCs/>
+          <w:color w:val="1B1B1E"/>
+          <w:sz w:val="26"/>
+          <w:szCs w:val="26"/>
+          <w:lang w:val="en-US"/>
+        </w:rPr>
         <w:t xml:space="preserve">Xây </w:t>
       </w:r>
       <w:r>
@@ -14048,6 +14811,18 @@
           <w:color w:val="1B1B1E"/>
           <w:sz w:val="26"/>
           <w:szCs w:val="26"/>
+          <w:lang w:val="en-US"/>
+        </w:rPr>
+        <w:t xml:space="preserve">         </w:t>
+      </w:r>
+      <w:r>
+        <w:rPr>
+          <w:rStyle w:val="ng-star-inserted"/>
+          <w:b/>
+          <w:bCs/>
+          <w:color w:val="1B1B1E"/>
+          <w:sz w:val="26"/>
+          <w:szCs w:val="26"/>
         </w:rPr>
         <w:t>Hiệu năng mô hình vượt trội</w:t>
       </w:r>
@@ -14101,6 +14876,18 @@
           <w:color w:val="1B1B1E"/>
           <w:sz w:val="26"/>
           <w:szCs w:val="26"/>
+          <w:lang w:val="en-US"/>
+        </w:rPr>
+        <w:t xml:space="preserve">         </w:t>
+      </w:r>
+      <w:r>
+        <w:rPr>
+          <w:rStyle w:val="ng-star-inserted"/>
+          <w:b/>
+          <w:bCs/>
+          <w:color w:val="1B1B1E"/>
+          <w:sz w:val="26"/>
+          <w:szCs w:val="26"/>
         </w:rPr>
         <w:t>Kiến trúc hệ thống chuẩn Microservices</w:t>
       </w:r>
@@ -14128,6 +14915,18 @@
           <w:szCs w:val="26"/>
         </w:rPr>
       </w:pPr>
+      <w:r>
+        <w:rPr>
+          <w:rStyle w:val="ng-star-inserted"/>
+          <w:b/>
+          <w:bCs/>
+          <w:color w:val="1B1B1E"/>
+          <w:sz w:val="26"/>
+          <w:szCs w:val="26"/>
+          <w:lang w:val="en-US"/>
+        </w:rPr>
+        <w:t xml:space="preserve">         </w:t>
+      </w:r>
       <w:r>
         <w:rPr>
           <w:rStyle w:val="ng-star-inserted"/>
@@ -14205,6 +15004,16 @@
           <w:sz w:val="26"/>
           <w:szCs w:val="26"/>
         </w:rPr>
+        <w:t xml:space="preserve">         </w:t>
+      </w:r>
+      <w:r>
+        <w:rPr>
+          <w:rFonts w:ascii="Times New Roman" w:hAnsi="Times New Roman" w:cs="Times New Roman"/>
+          <w:b/>
+          <w:bCs/>
+          <w:sz w:val="26"/>
+          <w:szCs w:val="26"/>
+        </w:rPr>
         <w:t>Quy mô và phạm vi dữ liệu</w:t>
       </w:r>
       <w:r>
@@ -14251,6 +15060,16 @@
           <w:sz w:val="26"/>
           <w:szCs w:val="26"/>
         </w:rPr>
+        <w:t xml:space="preserve">          </w:t>
+      </w:r>
+      <w:r>
+        <w:rPr>
+          <w:rFonts w:ascii="Times New Roman" w:hAnsi="Times New Roman" w:cs="Times New Roman"/>
+          <w:b/>
+          <w:bCs/>
+          <w:sz w:val="26"/>
+          <w:szCs w:val="26"/>
+        </w:rPr>
         <w:t>Tính giải thích của mô hình</w:t>
       </w:r>
       <w:r>
@@ -14339,14 +15158,28 @@
           <w:rFonts w:ascii="Times New Roman" w:hAnsi="Times New Roman" w:cs="Times New Roman"/>
           <w:b/>
           <w:bCs/>
+          <w:sz w:val="26"/>
+          <w:szCs w:val="26"/>
+        </w:rPr>
+        <w:t xml:space="preserve">           </w:t>
+      </w:r>
+      <w:r>
+        <w:rPr>
+          <w:rFonts w:ascii="Times New Roman" w:hAnsi="Times New Roman" w:cs="Times New Roman"/>
+          <w:b/>
+          <w:bCs/>
+          <w:sz w:val="26"/>
+          <w:szCs w:val="26"/>
         </w:rPr>
         <w:t>Mở rộng dữ liệu và thuật toán:</w:t>
       </w:r>
       <w:r>
         <w:rPr>
           <w:rFonts w:ascii="Times New Roman" w:hAnsi="Times New Roman" w:cs="Times New Roman"/>
-        </w:rPr>
-        <w:t xml:space="preserve"> Tiếp tục thu thập, bổ sung tập dữ liệu lớn hơn, đa dạng hóa các biến </w:t>
+          <w:sz w:val="26"/>
+          <w:szCs w:val="26"/>
+        </w:rPr>
+        <w:t xml:space="preserve"> Tiếp tục thu thập, bổ sung tập dữ liệu lớn hơn, đa dạng hóa các biến đầu vào (như bệnh sử, tiền sử y tế); thử nghiệm các thuật toán </w:t>
       </w:r>
       <w:r>
         <w:rPr>
@@ -14354,7 +15187,8 @@
           <w:sz w:val="26"/>
           <w:szCs w:val="26"/>
         </w:rPr>
-        <w:t xml:space="preserve">đầu vào (như bệnh sử, tiền sử y tế); thử nghiệm các thuật toán Boosting tiên tiến hơn như </w:t>
+        <w:lastRenderedPageBreak/>
+        <w:t xml:space="preserve">Boosting tiên tiến hơn như </w:t>
       </w:r>
       <w:r>
         <w:rPr>
@@ -14428,6 +15262,16 @@
           <w:sz w:val="26"/>
           <w:szCs w:val="26"/>
         </w:rPr>
+        <w:t xml:space="preserve">         </w:t>
+      </w:r>
+      <w:r>
+        <w:rPr>
+          <w:rFonts w:ascii="Times New Roman" w:hAnsi="Times New Roman" w:cs="Times New Roman"/>
+          <w:b/>
+          <w:bCs/>
+          <w:sz w:val="26"/>
+          <w:szCs w:val="26"/>
+        </w:rPr>
         <w:t>Nâng cấp tính năng ứng dụng:</w:t>
       </w:r>
       <w:r>
@@ -14466,6 +15310,16 @@
           <w:szCs w:val="26"/>
         </w:rPr>
       </w:pPr>
+      <w:r>
+        <w:rPr>
+          <w:rFonts w:ascii="Times New Roman" w:hAnsi="Times New Roman" w:cs="Times New Roman"/>
+          <w:b/>
+          <w:bCs/>
+          <w:sz w:val="26"/>
+          <w:szCs w:val="26"/>
+        </w:rPr>
+        <w:t xml:space="preserve">         </w:t>
+      </w:r>
       <w:r>
         <w:rPr>
           <w:rFonts w:ascii="Times New Roman" w:hAnsi="Times New Roman" w:cs="Times New Roman"/>
@@ -15211,7 +16065,7 @@
             </wp:anchor>
           </w:drawing>
         </mc:Choice>
-        <mc:Fallback xmlns:w16sdtfl="http://schemas.microsoft.com/office/word/2024/wordml/sdtformatlock" xmlns:w16du="http://schemas.microsoft.com/office/word/2023/wordml/word16du" xmlns:oel="http://schemas.microsoft.com/office/2019/extlst">
+        <mc:Fallback xmlns:oel="http://schemas.microsoft.com/office/2019/extlst" xmlns:w16du="http://schemas.microsoft.com/office/word/2023/wordml/word16du" xmlns:w16sdtfl="http://schemas.microsoft.com/office/word/2024/wordml/sdtformatlock">
           <w:pict>
             <v:line w14:anchorId="14DA849D" id="Straight Connector 4" o:spid="_x0000_s1026" style="position:absolute;z-index:251661312;visibility:visible;mso-wrap-style:square;mso-wrap-distance-left:9pt;mso-wrap-distance-top:0;mso-wrap-distance-right:9pt;mso-wrap-distance-bottom:0;mso-position-horizontal:absolute;mso-position-horizontal-relative:text;mso-position-vertical:absolute;mso-position-vertical-relative:text" from=".95pt,19.9pt" to="448.3pt,19.9pt" o:gfxdata="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" strokecolor="black [3200]" strokeweight=".5pt">
               <v:stroke joinstyle="miter"/>
@@ -15310,7 +16164,7 @@
             </wp:anchor>
           </w:drawing>
         </mc:Choice>
-        <mc:Fallback xmlns:w16sdtfl="http://schemas.microsoft.com/office/word/2024/wordml/sdtformatlock" xmlns:w16du="http://schemas.microsoft.com/office/word/2023/wordml/word16du" xmlns:oel="http://schemas.microsoft.com/office/2019/extlst">
+        <mc:Fallback xmlns:oel="http://schemas.microsoft.com/office/2019/extlst" xmlns:w16du="http://schemas.microsoft.com/office/word/2023/wordml/word16du" xmlns:w16sdtfl="http://schemas.microsoft.com/office/word/2024/wordml/sdtformatlock">
           <w:pict>
             <v:line w14:anchorId="4888ABD6" id="Straight Connector 17" o:spid="_x0000_s1026" style="position:absolute;z-index:251663360;visibility:visible;mso-wrap-style:square;mso-wrap-distance-left:9pt;mso-wrap-distance-top:0;mso-wrap-distance-right:9pt;mso-wrap-distance-bottom:0;mso-position-horizontal:absolute;mso-position-horizontal-relative:text;mso-position-vertical:absolute;mso-position-vertical-relative:text" from=".95pt,19.9pt" to="448.3pt,19.9pt" o:gfxdata="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" strokecolor="black [3200]" strokeweight=".5pt">
               <v:stroke joinstyle="miter"/>
@@ -16165,6 +17019,119 @@
     </w:lvl>
   </w:abstractNum>
   <w:abstractNum w:abstractNumId="8" w15:restartNumberingAfterBreak="0">
+    <w:nsid w:val="58016329"/>
+    <w:multiLevelType w:val="hybridMultilevel"/>
+    <w:tmpl w:val="AAC259B8"/>
+    <w:lvl w:ilvl="0" w:tplc="04090009">
+      <w:start w:val="1"/>
+      <w:numFmt w:val="bullet"/>
+      <w:lvlText w:val=""/>
+      <w:lvlJc w:val="left"/>
+      <w:pPr>
+        <w:ind w:left="1080" w:hanging="360"/>
+      </w:pPr>
+      <w:rPr>
+        <w:rFonts w:ascii="Wingdings" w:hAnsi="Wingdings" w:hint="default"/>
+      </w:rPr>
+    </w:lvl>
+    <w:lvl w:ilvl="1" w:tplc="04090003" w:tentative="1">
+      <w:start w:val="1"/>
+      <w:numFmt w:val="bullet"/>
+      <w:lvlText w:val="o"/>
+      <w:lvlJc w:val="left"/>
+      <w:pPr>
+        <w:ind w:left="1800" w:hanging="360"/>
+      </w:pPr>
+      <w:rPr>
+        <w:rFonts w:ascii="Courier New" w:hAnsi="Courier New" w:cs="Courier New" w:hint="default"/>
+      </w:rPr>
+    </w:lvl>
+    <w:lvl w:ilvl="2" w:tplc="04090005" w:tentative="1">
+      <w:start w:val="1"/>
+      <w:numFmt w:val="bullet"/>
+      <w:lvlText w:val=""/>
+      <w:lvlJc w:val="left"/>
+      <w:pPr>
+        <w:ind w:left="2520" w:hanging="360"/>
+      </w:pPr>
+      <w:rPr>
+        <w:rFonts w:ascii="Wingdings" w:hAnsi="Wingdings" w:hint="default"/>
+      </w:rPr>
+    </w:lvl>
+    <w:lvl w:ilvl="3" w:tplc="04090001" w:tentative="1">
+      <w:start w:val="1"/>
+      <w:numFmt w:val="bullet"/>
+      <w:lvlText w:val=""/>
+      <w:lvlJc w:val="left"/>
+      <w:pPr>
+        <w:ind w:left="3240" w:hanging="360"/>
+      </w:pPr>
+      <w:rPr>
+        <w:rFonts w:ascii="Symbol" w:hAnsi="Symbol" w:hint="default"/>
+      </w:rPr>
+    </w:lvl>
+    <w:lvl w:ilvl="4" w:tplc="04090003" w:tentative="1">
+      <w:start w:val="1"/>
+      <w:numFmt w:val="bullet"/>
+      <w:lvlText w:val="o"/>
+      <w:lvlJc w:val="left"/>
+      <w:pPr>
+        <w:ind w:left="3960" w:hanging="360"/>
+      </w:pPr>
+      <w:rPr>
+        <w:rFonts w:ascii="Courier New" w:hAnsi="Courier New" w:cs="Courier New" w:hint="default"/>
+      </w:rPr>
+    </w:lvl>
+    <w:lvl w:ilvl="5" w:tplc="04090005" w:tentative="1">
+      <w:start w:val="1"/>
+      <w:numFmt w:val="bullet"/>
+      <w:lvlText w:val=""/>
+      <w:lvlJc w:val="left"/>
+      <w:pPr>
+        <w:ind w:left="4680" w:hanging="360"/>
+      </w:pPr>
+      <w:rPr>
+        <w:rFonts w:ascii="Wingdings" w:hAnsi="Wingdings" w:hint="default"/>
+      </w:rPr>
+    </w:lvl>
+    <w:lvl w:ilvl="6" w:tplc="04090001" w:tentative="1">
+      <w:start w:val="1"/>
+      <w:numFmt w:val="bullet"/>
+      <w:lvlText w:val=""/>
+      <w:lvlJc w:val="left"/>
+      <w:pPr>
+        <w:ind w:left="5400" w:hanging="360"/>
+      </w:pPr>
+      <w:rPr>
+        <w:rFonts w:ascii="Symbol" w:hAnsi="Symbol" w:hint="default"/>
+      </w:rPr>
+    </w:lvl>
+    <w:lvl w:ilvl="7" w:tplc="04090003" w:tentative="1">
+      <w:start w:val="1"/>
+      <w:numFmt w:val="bullet"/>
+      <w:lvlText w:val="o"/>
+      <w:lvlJc w:val="left"/>
+      <w:pPr>
+        <w:ind w:left="6120" w:hanging="360"/>
+      </w:pPr>
+      <w:rPr>
+        <w:rFonts w:ascii="Courier New" w:hAnsi="Courier New" w:cs="Courier New" w:hint="default"/>
+      </w:rPr>
+    </w:lvl>
+    <w:lvl w:ilvl="8" w:tplc="04090005" w:tentative="1">
+      <w:start w:val="1"/>
+      <w:numFmt w:val="bullet"/>
+      <w:lvlText w:val=""/>
+      <w:lvlJc w:val="left"/>
+      <w:pPr>
+        <w:ind w:left="6840" w:hanging="360"/>
+      </w:pPr>
+      <w:rPr>
+        <w:rFonts w:ascii="Wingdings" w:hAnsi="Wingdings" w:hint="default"/>
+      </w:rPr>
+    </w:lvl>
+  </w:abstractNum>
+  <w:abstractNum w:abstractNumId="9" w15:restartNumberingAfterBreak="0">
     <w:nsid w:val="60710EC3"/>
     <w:multiLevelType w:val="multilevel"/>
     <w:tmpl w:val="AB22ADBE"/>
@@ -16280,7 +17247,7 @@
       </w:pPr>
     </w:lvl>
   </w:abstractNum>
-  <w:abstractNum w:abstractNumId="9" w15:restartNumberingAfterBreak="0">
+  <w:abstractNum w:abstractNumId="10" w15:restartNumberingAfterBreak="0">
     <w:nsid w:val="641C51A0"/>
     <w:multiLevelType w:val="hybridMultilevel"/>
     <w:tmpl w:val="5790C02A"/>
@@ -16397,13 +17364,13 @@
     <w:abstractNumId w:val="7"/>
   </w:num>
   <w:num w:numId="2">
-    <w:abstractNumId w:val="8"/>
+    <w:abstractNumId w:val="9"/>
   </w:num>
   <w:num w:numId="3">
     <w:abstractNumId w:val="2"/>
   </w:num>
   <w:num w:numId="4">
-    <w:abstractNumId w:val="9"/>
+    <w:abstractNumId w:val="10"/>
   </w:num>
   <w:num w:numId="5">
     <w:abstractNumId w:val="0"/>
@@ -16422,6 +17389,9 @@
   </w:num>
   <w:num w:numId="10">
     <w:abstractNumId w:val="6"/>
+  </w:num>
+  <w:num w:numId="11">
+    <w:abstractNumId w:val="8"/>
   </w:num>
   <w:numIdMacAtCleanup w:val="10"/>
 </w:numbering>

</xml_diff>